<commit_message>
Update backup script logic and add completed task screenshots
</commit_message>
<xml_diff>
--- a/Screenshots/Screen shot of various commands.docx
+++ b/Screenshots/Screen shot of various commands.docx
@@ -5,6 +5,9 @@
     <w:p/>
     <w:p>
       <w:r>
+        <w:rPr>
+          <w:noProof/>
+        </w:rPr>
         <w:drawing>
           <wp:inline distT="0" distB="0" distL="0" distR="0" wp14:anchorId="1629403D" wp14:editId="6BEF6958">
             <wp:extent cx="5943600" cy="3763010"/>
@@ -21,7 +24,7 @@
                     <pic:cNvPicPr/>
                   </pic:nvPicPr>
                   <pic:blipFill>
-                    <a:blip r:embed="rId4"/>
+                    <a:blip r:embed="rId6"/>
                     <a:stretch>
                       <a:fillRect/>
                     </a:stretch>
@@ -43,14 +46,41 @@
       </w:r>
     </w:p>
     <w:p>
+      <w:pPr>
+        <w:rPr>
+          <w:b/>
+          <w:bCs/>
+        </w:rPr>
+      </w:pPr>
       <w:proofErr w:type="spellStart"/>
       <w:r>
-        <w:t>htop</w:t>
+        <w:rPr>
+          <w:b/>
+          <w:bCs/>
+        </w:rPr>
+        <w:t>H</w:t>
+      </w:r>
+      <w:r>
+        <w:rPr>
+          <w:b/>
+          <w:bCs/>
+        </w:rPr>
+        <w:t>top</w:t>
       </w:r>
       <w:proofErr w:type="spellEnd"/>
-    </w:p>
-    <w:p>
-      <w:r>
+      <w:r>
+        <w:rPr>
+          <w:b/>
+          <w:bCs/>
+        </w:rPr>
+        <w:t xml:space="preserve"> Output</w:t>
+      </w:r>
+    </w:p>
+    <w:p>
+      <w:r>
+        <w:rPr>
+          <w:noProof/>
+        </w:rPr>
         <w:drawing>
           <wp:inline distT="0" distB="0" distL="0" distR="0" wp14:anchorId="409FF2F4" wp14:editId="797E983C">
             <wp:extent cx="5943600" cy="3002280"/>
@@ -67,7 +97,7 @@
                     <pic:cNvPicPr/>
                   </pic:nvPicPr>
                   <pic:blipFill>
-                    <a:blip r:embed="rId5"/>
+                    <a:blip r:embed="rId7"/>
                     <a:stretch>
                       <a:fillRect/>
                     </a:stretch>
@@ -92,6 +122,9 @@
     <w:p/>
     <w:p>
       <w:r>
+        <w:rPr>
+          <w:noProof/>
+        </w:rPr>
         <w:lastRenderedPageBreak/>
         <w:drawing>
           <wp:inline distT="0" distB="0" distL="0" distR="0" wp14:anchorId="6E909BFD" wp14:editId="2504D6B5">
@@ -109,7 +142,7 @@
                     <pic:cNvPicPr/>
                   </pic:nvPicPr>
                   <pic:blipFill>
-                    <a:blip r:embed="rId6"/>
+                    <a:blip r:embed="rId8"/>
                     <a:stretch>
                       <a:fillRect/>
                     </a:stretch>
@@ -130,17 +163,28 @@
         </w:drawing>
       </w:r>
     </w:p>
-    <w:p/>
-    <w:p/>
-    <w:p/>
-    <w:p/>
+    <w:p>
+      <w:pPr>
+        <w:rPr>
+          <w:b/>
+          <w:bCs/>
+        </w:rPr>
+      </w:pPr>
+      <w:r>
+        <w:rPr>
+          <w:b/>
+          <w:bCs/>
+        </w:rPr>
+        <w:t>Cron Tab for SARAH &amp; MIKE</w:t>
+      </w:r>
+    </w:p>
     <w:p>
       <w:r>
         <w:drawing>
-          <wp:inline distT="0" distB="0" distL="0" distR="0" wp14:anchorId="0905E001" wp14:editId="2C4DB3F6">
-            <wp:extent cx="5943600" cy="2658110"/>
-            <wp:effectExtent l="0" t="0" r="0" b="8890"/>
-            <wp:docPr id="1583390525" name="Picture 1"/>
+          <wp:inline distT="0" distB="0" distL="0" distR="0" wp14:anchorId="0DEF99E1" wp14:editId="7938C13D">
+            <wp:extent cx="5943600" cy="2883535"/>
+            <wp:effectExtent l="0" t="0" r="0" b="0"/>
+            <wp:docPr id="1023440197" name="Picture 1"/>
             <wp:cNvGraphicFramePr>
               <a:graphicFrameLocks xmlns:a="http://schemas.openxmlformats.org/drawingml/2006/main" noChangeAspect="1"/>
             </wp:cNvGraphicFramePr>
@@ -148,11 +192,11 @@
               <a:graphicData uri="http://schemas.openxmlformats.org/drawingml/2006/picture">
                 <pic:pic xmlns:pic="http://schemas.openxmlformats.org/drawingml/2006/picture">
                   <pic:nvPicPr>
-                    <pic:cNvPr id="1583390525" name=""/>
+                    <pic:cNvPr id="1023440197" name=""/>
                     <pic:cNvPicPr/>
                   </pic:nvPicPr>
                   <pic:blipFill>
-                    <a:blip r:embed="rId7"/>
+                    <a:blip r:embed="rId9"/>
                     <a:stretch>
                       <a:fillRect/>
                     </a:stretch>
@@ -160,7 +204,7 @@
                   <pic:spPr>
                     <a:xfrm>
                       <a:off x="0" y="0"/>
-                      <a:ext cx="5943600" cy="2658110"/>
+                      <a:ext cx="5943600" cy="2883535"/>
                     </a:xfrm>
                     <a:prstGeom prst="rect">
                       <a:avLst/>
@@ -173,6 +217,242 @@
         </w:drawing>
       </w:r>
     </w:p>
+    <w:p>
+      <w:r>
+        <w:rPr>
+          <w:b/>
+          <w:bCs/>
+        </w:rPr>
+        <w:t>Logs Output</w:t>
+      </w:r>
+    </w:p>
+    <w:p>
+      <w:pPr>
+        <w:ind w:firstLine="720"/>
+      </w:pPr>
+      <w:r>
+        <w:drawing>
+          <wp:inline distT="0" distB="0" distL="0" distR="0" wp14:anchorId="24A37CDC" wp14:editId="7B68D228">
+            <wp:extent cx="5943600" cy="2776855"/>
+            <wp:effectExtent l="0" t="0" r="0" b="4445"/>
+            <wp:docPr id="1834997315" name="Picture 1"/>
+            <wp:cNvGraphicFramePr>
+              <a:graphicFrameLocks xmlns:a="http://schemas.openxmlformats.org/drawingml/2006/main" noChangeAspect="1"/>
+            </wp:cNvGraphicFramePr>
+            <a:graphic xmlns:a="http://schemas.openxmlformats.org/drawingml/2006/main">
+              <a:graphicData uri="http://schemas.openxmlformats.org/drawingml/2006/picture">
+                <pic:pic xmlns:pic="http://schemas.openxmlformats.org/drawingml/2006/picture">
+                  <pic:nvPicPr>
+                    <pic:cNvPr id="1834997315" name=""/>
+                    <pic:cNvPicPr/>
+                  </pic:nvPicPr>
+                  <pic:blipFill>
+                    <a:blip r:embed="rId10"/>
+                    <a:stretch>
+                      <a:fillRect/>
+                    </a:stretch>
+                  </pic:blipFill>
+                  <pic:spPr>
+                    <a:xfrm>
+                      <a:off x="0" y="0"/>
+                      <a:ext cx="5943600" cy="2776855"/>
+                    </a:xfrm>
+                    <a:prstGeom prst="rect">
+                      <a:avLst/>
+                    </a:prstGeom>
+                  </pic:spPr>
+                </pic:pic>
+              </a:graphicData>
+            </a:graphic>
+          </wp:inline>
+        </w:drawing>
+      </w:r>
+    </w:p>
+    <w:p>
+      <w:pPr>
+        <w:tabs>
+          <w:tab w:val="left" w:pos="1215"/>
+        </w:tabs>
+      </w:pPr>
+      <w:r>
+        <w:tab/>
+      </w:r>
+    </w:p>
+    <w:p>
+      <w:pPr>
+        <w:tabs>
+          <w:tab w:val="left" w:pos="1215"/>
+        </w:tabs>
+      </w:pPr>
+    </w:p>
+    <w:p>
+      <w:pPr>
+        <w:tabs>
+          <w:tab w:val="left" w:pos="1215"/>
+        </w:tabs>
+        <w:rPr>
+          <w:b/>
+          <w:bCs/>
+        </w:rPr>
+      </w:pPr>
+      <w:r>
+        <w:rPr>
+          <w:b/>
+          <w:bCs/>
+        </w:rPr>
+        <w:lastRenderedPageBreak/>
+        <w:t>workspaces for S</w:t>
+      </w:r>
+      <w:r>
+        <w:rPr>
+          <w:b/>
+          <w:bCs/>
+        </w:rPr>
+        <w:t>ARAH</w:t>
+      </w:r>
+      <w:r>
+        <w:rPr>
+          <w:b/>
+          <w:bCs/>
+        </w:rPr>
+        <w:t xml:space="preserve"> and M</w:t>
+      </w:r>
+      <w:r>
+        <w:rPr>
+          <w:b/>
+          <w:bCs/>
+        </w:rPr>
+        <w:t>IKE and permission</w:t>
+      </w:r>
+      <w:r>
+        <w:rPr>
+          <w:b/>
+          <w:bCs/>
+        </w:rPr>
+        <w:t xml:space="preserve">. </w:t>
+      </w:r>
+    </w:p>
+    <w:p>
+      <w:pPr>
+        <w:tabs>
+          <w:tab w:val="left" w:pos="1215"/>
+        </w:tabs>
+      </w:pPr>
+    </w:p>
+    <w:p>
+      <w:pPr>
+        <w:tabs>
+          <w:tab w:val="left" w:pos="1215"/>
+        </w:tabs>
+      </w:pPr>
+      <w:r>
+        <w:drawing>
+          <wp:inline distT="0" distB="0" distL="0" distR="0" wp14:anchorId="04C5E19D" wp14:editId="216946C0">
+            <wp:extent cx="5943600" cy="2474595"/>
+            <wp:effectExtent l="0" t="0" r="0" b="1905"/>
+            <wp:docPr id="250351677" name="Picture 1"/>
+            <wp:cNvGraphicFramePr>
+              <a:graphicFrameLocks xmlns:a="http://schemas.openxmlformats.org/drawingml/2006/main" noChangeAspect="1"/>
+            </wp:cNvGraphicFramePr>
+            <a:graphic xmlns:a="http://schemas.openxmlformats.org/drawingml/2006/main">
+              <a:graphicData uri="http://schemas.openxmlformats.org/drawingml/2006/picture">
+                <pic:pic xmlns:pic="http://schemas.openxmlformats.org/drawingml/2006/picture">
+                  <pic:nvPicPr>
+                    <pic:cNvPr id="250351677" name=""/>
+                    <pic:cNvPicPr/>
+                  </pic:nvPicPr>
+                  <pic:blipFill>
+                    <a:blip r:embed="rId11"/>
+                    <a:stretch>
+                      <a:fillRect/>
+                    </a:stretch>
+                  </pic:blipFill>
+                  <pic:spPr>
+                    <a:xfrm>
+                      <a:off x="0" y="0"/>
+                      <a:ext cx="5943600" cy="2474595"/>
+                    </a:xfrm>
+                    <a:prstGeom prst="rect">
+                      <a:avLst/>
+                    </a:prstGeom>
+                  </pic:spPr>
+                </pic:pic>
+              </a:graphicData>
+            </a:graphic>
+          </wp:inline>
+        </w:drawing>
+      </w:r>
+    </w:p>
+    <w:p/>
+    <w:p>
+      <w:pPr>
+        <w:rPr>
+          <w:b/>
+          <w:bCs/>
+        </w:rPr>
+      </w:pPr>
+      <w:r>
+        <w:rPr>
+          <w:b/>
+          <w:bCs/>
+        </w:rPr>
+        <w:t>Logs</w:t>
+      </w:r>
+    </w:p>
+    <w:p>
+      <w:pPr>
+        <w:tabs>
+          <w:tab w:val="left" w:pos="1245"/>
+        </w:tabs>
+      </w:pPr>
+      <w:r>
+        <w:tab/>
+      </w:r>
+    </w:p>
+    <w:p>
+      <w:pPr>
+        <w:tabs>
+          <w:tab w:val="left" w:pos="1245"/>
+        </w:tabs>
+      </w:pPr>
+      <w:r>
+        <w:drawing>
+          <wp:inline distT="0" distB="0" distL="0" distR="0" wp14:anchorId="1F50ED00" wp14:editId="4D919EC1">
+            <wp:extent cx="5943600" cy="2265045"/>
+            <wp:effectExtent l="0" t="0" r="0" b="1905"/>
+            <wp:docPr id="2064921338" name="Picture 1"/>
+            <wp:cNvGraphicFramePr>
+              <a:graphicFrameLocks xmlns:a="http://schemas.openxmlformats.org/drawingml/2006/main" noChangeAspect="1"/>
+            </wp:cNvGraphicFramePr>
+            <a:graphic xmlns:a="http://schemas.openxmlformats.org/drawingml/2006/main">
+              <a:graphicData uri="http://schemas.openxmlformats.org/drawingml/2006/picture">
+                <pic:pic xmlns:pic="http://schemas.openxmlformats.org/drawingml/2006/picture">
+                  <pic:nvPicPr>
+                    <pic:cNvPr id="2064921338" name=""/>
+                    <pic:cNvPicPr/>
+                  </pic:nvPicPr>
+                  <pic:blipFill>
+                    <a:blip r:embed="rId12"/>
+                    <a:stretch>
+                      <a:fillRect/>
+                    </a:stretch>
+                  </pic:blipFill>
+                  <pic:spPr>
+                    <a:xfrm>
+                      <a:off x="0" y="0"/>
+                      <a:ext cx="5943600" cy="2265045"/>
+                    </a:xfrm>
+                    <a:prstGeom prst="rect">
+                      <a:avLst/>
+                    </a:prstGeom>
+                  </pic:spPr>
+                </pic:pic>
+              </a:graphicData>
+            </a:graphic>
+          </wp:inline>
+        </w:drawing>
+      </w:r>
+    </w:p>
     <w:sectPr>
       <w:pgSz w:w="12240" w:h="15840"/>
       <w:pgMar w:top="1440" w:right="1440" w:bottom="1440" w:left="1440" w:header="720" w:footer="720" w:gutter="0"/>
@@ -181,6 +461,56 @@
     </w:sectPr>
   </w:body>
 </w:document>
+</file>
+
+<file path=word/endnotes.xml><?xml version="1.0" encoding="utf-8"?>
+<w:endnotes xmlns:wpc="http://schemas.microsoft.com/office/word/2010/wordprocessingCanvas" xmlns:cx="http://schemas.microsoft.com/office/drawing/2014/chartex" xmlns:cx1="http://schemas.microsoft.com/office/drawing/2015/9/8/chartex" xmlns:cx2="http://schemas.microsoft.com/office/drawing/2015/10/21/chartex" xmlns:cx3="http://schemas.microsoft.com/office/drawing/2016/5/9/chartex" xmlns:cx4="http://schemas.microsoft.com/office/drawing/2016/5/10/chartex" xmlns:cx5="http://schemas.microsoft.com/office/drawing/2016/5/11/chartex" xmlns:cx6="http://schemas.microsoft.com/office/drawing/2016/5/12/chartex" xmlns:cx7="http://schemas.microsoft.com/office/drawing/2016/5/13/chartex" xmlns:cx8="http://schemas.microsoft.com/office/drawing/2016/5/14/chartex" xmlns:mc="http://schemas.openxmlformats.org/markup-compatibility/2006" xmlns:aink="http://schemas.microsoft.com/office/drawing/2016/ink" xmlns:am3d="http://schemas.microsoft.com/office/drawing/2017/model3d" xmlns:o="urn:schemas-microsoft-com:office:office" xmlns:oel="http://schemas.microsoft.com/office/2019/extlst" xmlns:r="http://schemas.openxmlformats.org/officeDocument/2006/relationships" xmlns:m="http://schemas.openxmlformats.org/officeDocument/2006/math" xmlns:v="urn:schemas-microsoft-com:vml" xmlns:wp14="http://schemas.microsoft.com/office/word/2010/wordprocessingDrawing" xmlns:wp="http://schemas.openxmlformats.org/drawingml/2006/wordprocessingDrawing" xmlns:w10="urn:schemas-microsoft-com:office:word" xmlns:w="http://schemas.openxmlformats.org/wordprocessingml/2006/main" xmlns:w14="http://schemas.microsoft.com/office/word/2010/wordml" xmlns:w15="http://schemas.microsoft.com/office/word/2012/wordml" xmlns:w16cex="http://schemas.microsoft.com/office/word/2018/wordml/cex" xmlns:w16cid="http://schemas.microsoft.com/office/word/2016/wordml/cid" xmlns:w16="http://schemas.microsoft.com/office/word/2018/wordml" xmlns:w16du="http://schemas.microsoft.com/office/word/2023/wordml/word16du" xmlns:w16sdtdh="http://schemas.microsoft.com/office/word/2020/wordml/sdtdatahash" xmlns:w16sdtfl="http://schemas.microsoft.com/office/word/2024/wordml/sdtformatlock" xmlns:w16se="http://schemas.microsoft.com/office/word/2015/wordml/symex" xmlns:wpg="http://schemas.microsoft.com/office/word/2010/wordprocessingGroup" xmlns:wpi="http://schemas.microsoft.com/office/word/2010/wordprocessingInk" xmlns:wne="http://schemas.microsoft.com/office/word/2006/wordml" xmlns:wps="http://schemas.microsoft.com/office/word/2010/wordprocessingShape" mc:Ignorable="w14 w15 w16se w16cid w16 w16cex w16sdtdh w16sdtfl w16du wp14">
+  <w:endnote w:type="separator" w:id="-1">
+    <w:p>
+      <w:pPr>
+        <w:spacing w:after="0" w:line="240" w:lineRule="auto"/>
+      </w:pPr>
+      <w:r>
+        <w:separator/>
+      </w:r>
+    </w:p>
+  </w:endnote>
+  <w:endnote w:type="continuationSeparator" w:id="0">
+    <w:p>
+      <w:pPr>
+        <w:spacing w:after="0" w:line="240" w:lineRule="auto"/>
+      </w:pPr>
+      <w:r>
+        <w:continuationSeparator/>
+      </w:r>
+    </w:p>
+  </w:endnote>
+</w:endnotes>
+</file>
+
+<file path=word/footnotes.xml><?xml version="1.0" encoding="utf-8"?>
+<w:footnotes xmlns:wpc="http://schemas.microsoft.com/office/word/2010/wordprocessingCanvas" xmlns:cx="http://schemas.microsoft.com/office/drawing/2014/chartex" xmlns:cx1="http://schemas.microsoft.com/office/drawing/2015/9/8/chartex" xmlns:cx2="http://schemas.microsoft.com/office/drawing/2015/10/21/chartex" xmlns:cx3="http://schemas.microsoft.com/office/drawing/2016/5/9/chartex" xmlns:cx4="http://schemas.microsoft.com/office/drawing/2016/5/10/chartex" xmlns:cx5="http://schemas.microsoft.com/office/drawing/2016/5/11/chartex" xmlns:cx6="http://schemas.microsoft.com/office/drawing/2016/5/12/chartex" xmlns:cx7="http://schemas.microsoft.com/office/drawing/2016/5/13/chartex" xmlns:cx8="http://schemas.microsoft.com/office/drawing/2016/5/14/chartex" xmlns:mc="http://schemas.openxmlformats.org/markup-compatibility/2006" xmlns:aink="http://schemas.microsoft.com/office/drawing/2016/ink" xmlns:am3d="http://schemas.microsoft.com/office/drawing/2017/model3d" xmlns:o="urn:schemas-microsoft-com:office:office" xmlns:oel="http://schemas.microsoft.com/office/2019/extlst" xmlns:r="http://schemas.openxmlformats.org/officeDocument/2006/relationships" xmlns:m="http://schemas.openxmlformats.org/officeDocument/2006/math" xmlns:v="urn:schemas-microsoft-com:vml" xmlns:wp14="http://schemas.microsoft.com/office/word/2010/wordprocessingDrawing" xmlns:wp="http://schemas.openxmlformats.org/drawingml/2006/wordprocessingDrawing" xmlns:w10="urn:schemas-microsoft-com:office:word" xmlns:w="http://schemas.openxmlformats.org/wordprocessingml/2006/main" xmlns:w14="http://schemas.microsoft.com/office/word/2010/wordml" xmlns:w15="http://schemas.microsoft.com/office/word/2012/wordml" xmlns:w16cex="http://schemas.microsoft.com/office/word/2018/wordml/cex" xmlns:w16cid="http://schemas.microsoft.com/office/word/2016/wordml/cid" xmlns:w16="http://schemas.microsoft.com/office/word/2018/wordml" xmlns:w16du="http://schemas.microsoft.com/office/word/2023/wordml/word16du" xmlns:w16sdtdh="http://schemas.microsoft.com/office/word/2020/wordml/sdtdatahash" xmlns:w16sdtfl="http://schemas.microsoft.com/office/word/2024/wordml/sdtformatlock" xmlns:w16se="http://schemas.microsoft.com/office/word/2015/wordml/symex" xmlns:wpg="http://schemas.microsoft.com/office/word/2010/wordprocessingGroup" xmlns:wpi="http://schemas.microsoft.com/office/word/2010/wordprocessingInk" xmlns:wne="http://schemas.microsoft.com/office/word/2006/wordml" xmlns:wps="http://schemas.microsoft.com/office/word/2010/wordprocessingShape" mc:Ignorable="w14 w15 w16se w16cid w16 w16cex w16sdtdh w16sdtfl w16du wp14">
+  <w:footnote w:type="separator" w:id="-1">
+    <w:p>
+      <w:pPr>
+        <w:spacing w:after="0" w:line="240" w:lineRule="auto"/>
+      </w:pPr>
+      <w:r>
+        <w:separator/>
+      </w:r>
+    </w:p>
+  </w:footnote>
+  <w:footnote w:type="continuationSeparator" w:id="0">
+    <w:p>
+      <w:pPr>
+        <w:spacing w:after="0" w:line="240" w:lineRule="auto"/>
+      </w:pPr>
+      <w:r>
+        <w:continuationSeparator/>
+      </w:r>
+    </w:p>
+  </w:footnote>
+</w:footnotes>
 </file>
 
 <file path=word/styles.xml><?xml version="1.0" encoding="utf-8"?>
@@ -786,7 +1116,6 @@
   <w:style w:type="character" w:default="1" w:styleId="DefaultParagraphFont">
     <w:name w:val="Default Paragraph Font"/>
     <w:uiPriority w:val="1"/>
-    <w:semiHidden/>
     <w:unhideWhenUsed/>
   </w:style>
   <w:style w:type="table" w:default="1" w:styleId="TableNormal">
@@ -1099,6 +1428,50 @@
       <w:color w:val="2F5496" w:themeColor="accent1" w:themeShade="BF"/>
       <w:spacing w:val="5"/>
     </w:rPr>
+  </w:style>
+  <w:style w:type="paragraph" w:styleId="Header">
+    <w:name w:val="header"/>
+    <w:basedOn w:val="Normal"/>
+    <w:link w:val="HeaderChar"/>
+    <w:uiPriority w:val="99"/>
+    <w:unhideWhenUsed/>
+    <w:rsid w:val="00B60223"/>
+    <w:pPr>
+      <w:tabs>
+        <w:tab w:val="center" w:pos="4680"/>
+        <w:tab w:val="right" w:pos="9360"/>
+      </w:tabs>
+      <w:spacing w:after="0" w:line="240" w:lineRule="auto"/>
+    </w:pPr>
+  </w:style>
+  <w:style w:type="character" w:customStyle="1" w:styleId="HeaderChar">
+    <w:name w:val="Header Char"/>
+    <w:basedOn w:val="DefaultParagraphFont"/>
+    <w:link w:val="Header"/>
+    <w:uiPriority w:val="99"/>
+    <w:rsid w:val="00B60223"/>
+  </w:style>
+  <w:style w:type="paragraph" w:styleId="Footer">
+    <w:name w:val="footer"/>
+    <w:basedOn w:val="Normal"/>
+    <w:link w:val="FooterChar"/>
+    <w:uiPriority w:val="99"/>
+    <w:unhideWhenUsed/>
+    <w:rsid w:val="00B60223"/>
+    <w:pPr>
+      <w:tabs>
+        <w:tab w:val="center" w:pos="4680"/>
+        <w:tab w:val="right" w:pos="9360"/>
+      </w:tabs>
+      <w:spacing w:after="0" w:line="240" w:lineRule="auto"/>
+    </w:pPr>
+  </w:style>
+  <w:style w:type="character" w:customStyle="1" w:styleId="FooterChar">
+    <w:name w:val="Footer Char"/>
+    <w:basedOn w:val="DefaultParagraphFont"/>
+    <w:link w:val="Footer"/>
+    <w:uiPriority w:val="99"/>
+    <w:rsid w:val="00B60223"/>
   </w:style>
 </w:styles>
 </file>

</xml_diff>